<commit_message>
Added new Odrive Code
Added new testable Odrive code
</commit_message>
<xml_diff>
--- a/O-Drive/ODrive Instructions.docx
+++ b/O-Drive/ODrive Instructions.docx
@@ -35,15 +35,10 @@
     <w:p>
       <w:pPr>
         <w:rPr>
-          <w:lang w:val="en-US"/>
-        </w:rPr>
-      </w:pPr>
-    </w:p>
-    <w:p>
-      <w:pPr>
-        <w:rPr>
           <w:b/>
           <w:bCs/>
+          <w:sz w:val="26"/>
+          <w:szCs w:val="26"/>
           <w:lang w:val="en-US"/>
         </w:rPr>
       </w:pPr>
@@ -51,6 +46,8 @@
         <w:rPr>
           <w:b/>
           <w:bCs/>
+          <w:sz w:val="26"/>
+          <w:szCs w:val="26"/>
           <w:lang w:val="en-US"/>
         </w:rPr>
         <w:t>Commands:</w:t>
@@ -65,7 +62,23 @@
         </w:numPr>
       </w:pPr>
       <w:r>
-        <w:t>odrv0.axis0.motor.config.current_lim = 10</w:t>
+        <w:t>odrv0.axis</w:t>
+      </w:r>
+      <w:proofErr w:type="gramStart"/>
+      <w:r>
+        <w:t>0.motor</w:t>
+      </w:r>
+      <w:proofErr w:type="gramEnd"/>
+      <w:r>
+        <w:t>.</w:t>
+      </w:r>
+      <w:proofErr w:type="gramStart"/>
+      <w:r>
+        <w:t>config.current</w:t>
+      </w:r>
+      <w:proofErr w:type="gramEnd"/>
+      <w:r>
+        <w:t>_lim = 10</w:t>
       </w:r>
     </w:p>
     <w:p>
@@ -97,19 +110,11 @@
           <w:lang w:val="en-US"/>
         </w:rPr>
       </w:pPr>
-      <w:proofErr w:type="gramStart"/>
-      <w:r>
-        <w:rPr>
-          <w:lang w:val="en-US"/>
-        </w:rPr>
-        <w:t>odrv0.config.brake</w:t>
-      </w:r>
-      <w:proofErr w:type="gramEnd"/>
-      <w:r>
-        <w:rPr>
-          <w:lang w:val="en-US"/>
-        </w:rPr>
-        <w:t>_resistance = 2</w:t>
+      <w:r>
+        <w:rPr>
+          <w:lang w:val="en-US"/>
+        </w:rPr>
+        <w:t>odrv0.config.brake_resistance = 2</w:t>
       </w:r>
     </w:p>
     <w:p>
@@ -127,35 +132,7 @@
         <w:rPr>
           <w:lang w:val="en-US"/>
         </w:rPr>
-        <w:t>odrv0.axis</w:t>
-      </w:r>
-      <w:proofErr w:type="gramStart"/>
-      <w:r>
-        <w:rPr>
-          <w:lang w:val="en-US"/>
-        </w:rPr>
-        <w:t>0.motor</w:t>
-      </w:r>
-      <w:proofErr w:type="gramEnd"/>
-      <w:r>
-        <w:rPr>
-          <w:lang w:val="en-US"/>
-        </w:rPr>
-        <w:t>.</w:t>
-      </w:r>
-      <w:proofErr w:type="gramStart"/>
-      <w:r>
-        <w:rPr>
-          <w:lang w:val="en-US"/>
-        </w:rPr>
-        <w:t>config.pole</w:t>
-      </w:r>
-      <w:proofErr w:type="gramEnd"/>
-      <w:r>
-        <w:rPr>
-          <w:lang w:val="en-US"/>
-        </w:rPr>
-        <w:t>_pairs</w:t>
+        <w:t>odrv0.axis0.motor.config.pole_pairs</w:t>
       </w:r>
       <w:r>
         <w:rPr>
@@ -179,35 +156,7 @@
         <w:rPr>
           <w:lang w:val="en-US"/>
         </w:rPr>
-        <w:t>odrv0.axis</w:t>
-      </w:r>
-      <w:proofErr w:type="gramStart"/>
-      <w:r>
-        <w:rPr>
-          <w:lang w:val="en-US"/>
-        </w:rPr>
-        <w:t>0.motor</w:t>
-      </w:r>
-      <w:proofErr w:type="gramEnd"/>
-      <w:r>
-        <w:rPr>
-          <w:lang w:val="en-US"/>
-        </w:rPr>
-        <w:t>.</w:t>
-      </w:r>
-      <w:proofErr w:type="gramStart"/>
-      <w:r>
-        <w:rPr>
-          <w:lang w:val="en-US"/>
-        </w:rPr>
-        <w:t>config.torque</w:t>
-      </w:r>
-      <w:proofErr w:type="gramEnd"/>
-      <w:r>
-        <w:rPr>
-          <w:lang w:val="en-US"/>
-        </w:rPr>
-        <w:t>_constant = 0.5</w:t>
+        <w:t>odrv0.axis0.motor.config.torque_constant = 0.5</w:t>
       </w:r>
     </w:p>
     <w:p>
@@ -225,35 +174,7 @@
         <w:rPr>
           <w:lang w:val="en-US"/>
         </w:rPr>
-        <w:t>odrv0.axis</w:t>
-      </w:r>
-      <w:proofErr w:type="gramStart"/>
-      <w:r>
-        <w:rPr>
-          <w:lang w:val="en-US"/>
-        </w:rPr>
-        <w:t>0.motor</w:t>
-      </w:r>
-      <w:proofErr w:type="gramEnd"/>
-      <w:r>
-        <w:rPr>
-          <w:lang w:val="en-US"/>
-        </w:rPr>
-        <w:t>.</w:t>
-      </w:r>
-      <w:proofErr w:type="gramStart"/>
-      <w:r>
-        <w:rPr>
-          <w:lang w:val="en-US"/>
-        </w:rPr>
-        <w:t>config.motor</w:t>
-      </w:r>
-      <w:proofErr w:type="gramEnd"/>
-      <w:r>
-        <w:rPr>
-          <w:lang w:val="en-US"/>
-        </w:rPr>
-        <w:t>_type = 0</w:t>
+        <w:t>odrv0.axis0.motor.config.motor_type = 0</w:t>
       </w:r>
     </w:p>
     <w:p>
@@ -286,21 +207,7 @@
         <w:rPr>
           <w:lang w:val="en-US"/>
         </w:rPr>
-        <w:t>odrv0.save_</w:t>
-      </w:r>
-      <w:proofErr w:type="gramStart"/>
-      <w:r>
-        <w:rPr>
-          <w:lang w:val="en-US"/>
-        </w:rPr>
-        <w:t>configuration(</w:t>
-      </w:r>
-      <w:proofErr w:type="gramEnd"/>
-      <w:r>
-        <w:rPr>
-          <w:lang w:val="en-US"/>
-        </w:rPr>
-        <w:t>)</w:t>
+        <w:t>odrv0.save_configuration()</w:t>
       </w:r>
     </w:p>
     <w:p>
@@ -911,25 +818,92 @@
         <w:pStyle w:val="HTMLPreformatted"/>
         <w:rPr>
           <w:rFonts w:asciiTheme="minorHAnsi" w:hAnsiTheme="minorHAnsi"/>
-          <w:sz w:val="22"/>
-          <w:szCs w:val="22"/>
-        </w:rPr>
-      </w:pPr>
-    </w:p>
-    <w:p>
-      <w:pPr>
-        <w:ind w:left="360"/>
-      </w:pPr>
-      <w:r>
-        <w:t>odrv0.axis0.motor.config.current_lim = 10</w:t>
-      </w:r>
-    </w:p>
-    <w:p>
-      <w:pPr>
-        <w:ind w:left="360"/>
-        <w:rPr>
-          <w:lang w:val="en-US"/>
-        </w:rPr>
+          <w:b/>
+          <w:bCs/>
+          <w:sz w:val="22"/>
+          <w:szCs w:val="22"/>
+        </w:rPr>
+      </w:pPr>
+      <w:r>
+        <w:rPr>
+          <w:rFonts w:asciiTheme="minorHAnsi" w:hAnsiTheme="minorHAnsi"/>
+          <w:b/>
+          <w:bCs/>
+          <w:sz w:val="22"/>
+          <w:szCs w:val="22"/>
+        </w:rPr>
+        <w:t>Copyable Instructions</w:t>
+      </w:r>
+      <w:r>
+        <w:rPr>
+          <w:rFonts w:asciiTheme="minorHAnsi" w:hAnsiTheme="minorHAnsi"/>
+          <w:b/>
+          <w:bCs/>
+          <w:sz w:val="22"/>
+          <w:szCs w:val="22"/>
+        </w:rPr>
+        <w:t xml:space="preserve">: </w:t>
+      </w:r>
+    </w:p>
+    <w:p>
+      <w:pPr>
+        <w:pStyle w:val="HTMLPreformatted"/>
+        <w:rPr>
+          <w:rFonts w:asciiTheme="minorHAnsi" w:hAnsiTheme="minorHAnsi"/>
+          <w:b/>
+          <w:bCs/>
+          <w:sz w:val="22"/>
+          <w:szCs w:val="22"/>
+        </w:rPr>
+      </w:pPr>
+      <w:r>
+        <w:rPr>
+          <w:rFonts w:asciiTheme="minorHAnsi" w:hAnsiTheme="minorHAnsi"/>
+          <w:b/>
+          <w:bCs/>
+          <w:sz w:val="22"/>
+          <w:szCs w:val="22"/>
+        </w:rPr>
+        <w:t>Axis 0</w:t>
+      </w:r>
+      <w:r>
+        <w:rPr>
+          <w:rFonts w:asciiTheme="minorHAnsi" w:hAnsiTheme="minorHAnsi"/>
+          <w:b/>
+          <w:bCs/>
+          <w:sz w:val="22"/>
+          <w:szCs w:val="22"/>
+        </w:rPr>
+        <w:t xml:space="preserve"> - </w:t>
+      </w:r>
+    </w:p>
+    <w:p>
+      <w:pPr>
+        <w:spacing w:after="0" w:line="240" w:lineRule="auto"/>
+      </w:pPr>
+      <w:r>
+        <w:t>odrv0.axis</w:t>
+      </w:r>
+      <w:proofErr w:type="gramStart"/>
+      <w:r>
+        <w:t>0.motor</w:t>
+      </w:r>
+      <w:proofErr w:type="gramEnd"/>
+      <w:r>
+        <w:t>.</w:t>
+      </w:r>
+      <w:proofErr w:type="gramStart"/>
+      <w:r>
+        <w:t>config.current</w:t>
+      </w:r>
+      <w:proofErr w:type="gramEnd"/>
+      <w:r>
+        <w:t>_lim = 10</w:t>
+      </w:r>
+    </w:p>
+    <w:p>
+      <w:pPr>
+        <w:spacing w:after="0" w:line="240" w:lineRule="auto"/>
       </w:pPr>
       <w:r>
         <w:rPr>
@@ -940,206 +914,142 @@
     </w:p>
     <w:p>
       <w:pPr>
-        <w:ind w:left="360"/>
-        <w:rPr>
-          <w:lang w:val="en-US"/>
-        </w:rPr>
-      </w:pPr>
+        <w:spacing w:after="0" w:line="240" w:lineRule="auto"/>
+      </w:pPr>
+      <w:r>
+        <w:rPr>
+          <w:lang w:val="en-US"/>
+        </w:rPr>
+        <w:t>odrv0.config.brake_resistance = 2</w:t>
+      </w:r>
+    </w:p>
+    <w:p>
+      <w:pPr>
+        <w:spacing w:after="0" w:line="240" w:lineRule="auto"/>
+      </w:pPr>
+      <w:r>
+        <w:rPr>
+          <w:lang w:val="en-US"/>
+        </w:rPr>
+        <w:t>odrv0.axis0.motor.config.pole_pairs = 4</w:t>
+      </w:r>
+    </w:p>
+    <w:p>
+      <w:pPr>
+        <w:spacing w:after="0" w:line="240" w:lineRule="auto"/>
+        <w:rPr>
+          <w:lang w:val="en-US"/>
+        </w:rPr>
+      </w:pPr>
+      <w:r>
+        <w:rPr>
+          <w:lang w:val="en-US"/>
+        </w:rPr>
+        <w:t>odrv0.axis0.motor.config.torque_constant = 0.5</w:t>
+      </w:r>
+    </w:p>
+    <w:p>
+      <w:pPr>
+        <w:spacing w:after="0" w:line="240" w:lineRule="auto"/>
+        <w:rPr>
+          <w:lang w:val="en-US"/>
+        </w:rPr>
+      </w:pPr>
+      <w:r>
+        <w:rPr>
+          <w:lang w:val="en-US"/>
+        </w:rPr>
+        <w:t>odrv0.axis0.motor.config.motor_type = 0</w:t>
+      </w:r>
+    </w:p>
+    <w:p>
+      <w:pPr>
+        <w:spacing w:after="0" w:line="240" w:lineRule="auto"/>
+        <w:rPr>
+          <w:lang w:val="en-US"/>
+        </w:rPr>
+      </w:pPr>
+      <w:r>
+        <w:t>odrv0.axis0.encoder.config.cpr = 24</w:t>
+      </w:r>
+    </w:p>
+    <w:p>
+      <w:pPr>
+        <w:spacing w:after="0" w:line="240" w:lineRule="auto"/>
+        <w:rPr>
+          <w:lang w:val="en-US"/>
+        </w:rPr>
+      </w:pPr>
+      <w:r>
+        <w:rPr>
+          <w:lang w:val="en-US"/>
+        </w:rPr>
+        <w:t>odrv0.save_configuration()</w:t>
+      </w:r>
+    </w:p>
+    <w:p>
+      <w:pPr>
+        <w:spacing w:after="0" w:line="240" w:lineRule="auto"/>
+        <w:rPr>
+          <w:lang w:val="en-US"/>
+        </w:rPr>
+      </w:pPr>
+    </w:p>
+    <w:p>
+      <w:pPr>
+        <w:spacing w:after="0" w:line="240" w:lineRule="auto"/>
+        <w:rPr>
+          <w:lang w:val="en-US"/>
+        </w:rPr>
+      </w:pPr>
+      <w:r>
+        <w:rPr>
+          <w:rFonts w:eastAsia="Times New Roman" w:cs="Courier New"/>
+          <w:kern w:val="0"/>
+          <w:lang w:eastAsia="en-AU"/>
+          <w14:ligatures w14:val="none"/>
+        </w:rPr>
+        <w:t>odrv0.axis</w:t>
+      </w:r>
       <w:proofErr w:type="gramStart"/>
       <w:r>
         <w:rPr>
-          <w:lang w:val="en-US"/>
-        </w:rPr>
-        <w:t>odrv0.config.brake</w:t>
+          <w:rFonts w:eastAsia="Times New Roman" w:cs="Courier New"/>
+          <w:kern w:val="0"/>
+          <w:lang w:eastAsia="en-AU"/>
+          <w14:ligatures w14:val="none"/>
+        </w:rPr>
+        <w:t>0.encoder</w:t>
       </w:r>
       <w:proofErr w:type="gramEnd"/>
       <w:r>
         <w:rPr>
-          <w:lang w:val="en-US"/>
-        </w:rPr>
-        <w:t>_resistance = 2</w:t>
-      </w:r>
-    </w:p>
-    <w:p>
-      <w:pPr>
-        <w:ind w:left="360"/>
-        <w:rPr>
-          <w:lang w:val="en-US"/>
-        </w:rPr>
-      </w:pPr>
-      <w:r>
-        <w:rPr>
-          <w:lang w:val="en-US"/>
-        </w:rPr>
-        <w:t>odrv0.axis</w:t>
+          <w:rFonts w:eastAsia="Times New Roman" w:cs="Courier New"/>
+          <w:kern w:val="0"/>
+          <w:lang w:eastAsia="en-AU"/>
+          <w14:ligatures w14:val="none"/>
+        </w:rPr>
+        <w:t>.</w:t>
       </w:r>
       <w:proofErr w:type="gramStart"/>
       <w:r>
         <w:rPr>
-          <w:lang w:val="en-US"/>
-        </w:rPr>
-        <w:t>0.motor</w:t>
+          <w:rFonts w:eastAsia="Times New Roman" w:cs="Courier New"/>
+          <w:kern w:val="0"/>
+          <w:lang w:eastAsia="en-AU"/>
+          <w14:ligatures w14:val="none"/>
+        </w:rPr>
+        <w:t>config.mode</w:t>
       </w:r>
       <w:proofErr w:type="gramEnd"/>
       <w:r>
         <w:rPr>
-          <w:lang w:val="en-US"/>
-        </w:rPr>
-        <w:t>.</w:t>
-      </w:r>
-      <w:proofErr w:type="gramStart"/>
-      <w:r>
-        <w:rPr>
-          <w:lang w:val="en-US"/>
-        </w:rPr>
-        <w:t>config.pole</w:t>
-      </w:r>
-      <w:proofErr w:type="gramEnd"/>
-      <w:r>
-        <w:rPr>
-          <w:lang w:val="en-US"/>
-        </w:rPr>
-        <w:t>_pairs = 4</w:t>
-      </w:r>
-    </w:p>
-    <w:p>
-      <w:pPr>
-        <w:ind w:left="360"/>
-        <w:rPr>
-          <w:lang w:val="en-US"/>
-        </w:rPr>
-      </w:pPr>
-      <w:r>
-        <w:rPr>
-          <w:lang w:val="en-US"/>
-        </w:rPr>
-        <w:t>odrv0.axis</w:t>
-      </w:r>
-      <w:proofErr w:type="gramStart"/>
-      <w:r>
-        <w:rPr>
-          <w:lang w:val="en-US"/>
-        </w:rPr>
-        <w:t>0.motor</w:t>
-      </w:r>
-      <w:proofErr w:type="gramEnd"/>
-      <w:r>
-        <w:rPr>
-          <w:lang w:val="en-US"/>
-        </w:rPr>
-        <w:t>.</w:t>
-      </w:r>
-      <w:proofErr w:type="gramStart"/>
-      <w:r>
-        <w:rPr>
-          <w:lang w:val="en-US"/>
-        </w:rPr>
-        <w:t>config.torque</w:t>
-      </w:r>
-      <w:proofErr w:type="gramEnd"/>
-      <w:r>
-        <w:rPr>
-          <w:lang w:val="en-US"/>
-        </w:rPr>
-        <w:t>_constant = 0.5</w:t>
-      </w:r>
-    </w:p>
-    <w:p>
-      <w:pPr>
-        <w:ind w:left="360"/>
-        <w:rPr>
-          <w:lang w:val="en-US"/>
-        </w:rPr>
-      </w:pPr>
-      <w:r>
-        <w:rPr>
-          <w:lang w:val="en-US"/>
-        </w:rPr>
-        <w:t>odrv0.axis</w:t>
-      </w:r>
-      <w:proofErr w:type="gramStart"/>
-      <w:r>
-        <w:rPr>
-          <w:lang w:val="en-US"/>
-        </w:rPr>
-        <w:t>0.motor</w:t>
-      </w:r>
-      <w:proofErr w:type="gramEnd"/>
-      <w:r>
-        <w:rPr>
-          <w:lang w:val="en-US"/>
-        </w:rPr>
-        <w:t>.</w:t>
-      </w:r>
-      <w:proofErr w:type="gramStart"/>
-      <w:r>
-        <w:rPr>
-          <w:lang w:val="en-US"/>
-        </w:rPr>
-        <w:t>config.motor</w:t>
-      </w:r>
-      <w:proofErr w:type="gramEnd"/>
-      <w:r>
-        <w:rPr>
-          <w:lang w:val="en-US"/>
-        </w:rPr>
-        <w:t>_type = 0</w:t>
-      </w:r>
-    </w:p>
-    <w:p>
-      <w:pPr>
-        <w:ind w:left="360"/>
-        <w:rPr>
-          <w:lang w:val="en-US"/>
-        </w:rPr>
-      </w:pPr>
-      <w:r>
-        <w:t>odrv0.axis0.encoder.config.cpr = 24</w:t>
-      </w:r>
-    </w:p>
-    <w:p>
-      <w:pPr>
-        <w:ind w:left="360"/>
-        <w:rPr>
-          <w:lang w:val="en-US"/>
-        </w:rPr>
-      </w:pPr>
-      <w:r>
-        <w:rPr>
-          <w:lang w:val="en-US"/>
-        </w:rPr>
-        <w:t>odrv0.save_</w:t>
-      </w:r>
-      <w:proofErr w:type="gramStart"/>
-      <w:r>
-        <w:rPr>
-          <w:lang w:val="en-US"/>
-        </w:rPr>
-        <w:t>configuration(</w:t>
-      </w:r>
-      <w:proofErr w:type="gramEnd"/>
-      <w:r>
-        <w:rPr>
-          <w:lang w:val="en-US"/>
-        </w:rPr>
-        <w:t>)</w:t>
-      </w:r>
-    </w:p>
-    <w:p>
-      <w:pPr>
-        <w:ind w:left="360"/>
-        <w:rPr>
-          <w:lang w:val="en-US"/>
-        </w:rPr>
-      </w:pPr>
-      <w:r>
-        <w:rPr>
-          <w:rFonts w:eastAsia="Times New Roman" w:cs="Courier New"/>
-          <w:kern w:val="0"/>
-          <w:lang w:eastAsia="en-AU"/>
-          <w14:ligatures w14:val="none"/>
-        </w:rPr>
-        <w:t>odrv0.axis0.encoder.config.mode = ENCODER_MODE_HALL</w:t>
+          <w:rFonts w:eastAsia="Times New Roman" w:cs="Courier New"/>
+          <w:kern w:val="0"/>
+          <w:lang w:eastAsia="en-AU"/>
+          <w14:ligatures w14:val="none"/>
+        </w:rPr>
+        <w:t xml:space="preserve"> = ENCODER_MODE_HALL</w:t>
       </w:r>
     </w:p>
     <w:p>
@@ -1163,7 +1073,6 @@
           <w:tab w:val="left" w:pos="14656"/>
         </w:tabs>
         <w:spacing w:after="0" w:line="240" w:lineRule="auto"/>
-        <w:ind w:left="360"/>
         <w:rPr>
           <w:rFonts w:eastAsia="Times New Roman" w:cs="Courier New"/>
           <w:kern w:val="0"/>
@@ -1211,42 +1120,88 @@
           <w:tab w:val="left" w:pos="14656"/>
         </w:tabs>
         <w:spacing w:after="0" w:line="240" w:lineRule="auto"/>
-        <w:ind w:left="360"/>
-        <w:rPr>
-          <w:rFonts w:eastAsia="Times New Roman" w:cs="Courier New"/>
-          <w:kern w:val="0"/>
-          <w:lang w:eastAsia="en-AU"/>
-          <w14:ligatures w14:val="none"/>
-        </w:rPr>
-      </w:pPr>
-      <w:r>
-        <w:rPr>
-          <w:rFonts w:eastAsia="Times New Roman" w:cs="Courier New"/>
-          <w:kern w:val="0"/>
-          <w:lang w:eastAsia="en-AU"/>
-          <w14:ligatures w14:val="none"/>
-        </w:rPr>
-        <w:t>odrv0.axis0.encoder.config.calib_scan_distance = 150</w:t>
+        <w:rPr>
+          <w:rFonts w:eastAsia="Times New Roman" w:cs="Courier New"/>
+          <w:kern w:val="0"/>
+          <w:lang w:eastAsia="en-AU"/>
+          <w14:ligatures w14:val="none"/>
+        </w:rPr>
+      </w:pPr>
+      <w:r>
+        <w:rPr>
+          <w:rFonts w:eastAsia="Times New Roman" w:cs="Courier New"/>
+          <w:kern w:val="0"/>
+          <w:lang w:eastAsia="en-AU"/>
+          <w14:ligatures w14:val="none"/>
+        </w:rPr>
+        <w:t>odrv0.axis</w:t>
+      </w:r>
+      <w:proofErr w:type="gramStart"/>
+      <w:r>
+        <w:rPr>
+          <w:rFonts w:eastAsia="Times New Roman" w:cs="Courier New"/>
+          <w:kern w:val="0"/>
+          <w:lang w:eastAsia="en-AU"/>
+          <w14:ligatures w14:val="none"/>
+        </w:rPr>
+        <w:t>0.encoder</w:t>
+      </w:r>
+      <w:proofErr w:type="gramEnd"/>
+      <w:r>
+        <w:rPr>
+          <w:rFonts w:eastAsia="Times New Roman" w:cs="Courier New"/>
+          <w:kern w:val="0"/>
+          <w:lang w:eastAsia="en-AU"/>
+          <w14:ligatures w14:val="none"/>
+        </w:rPr>
+        <w:t>.</w:t>
+      </w:r>
+      <w:proofErr w:type="gramStart"/>
+      <w:r>
+        <w:rPr>
+          <w:rFonts w:eastAsia="Times New Roman" w:cs="Courier New"/>
+          <w:kern w:val="0"/>
+          <w:lang w:eastAsia="en-AU"/>
+          <w14:ligatures w14:val="none"/>
+        </w:rPr>
+        <w:t>config.calib</w:t>
+      </w:r>
+      <w:proofErr w:type="gramEnd"/>
+      <w:r>
+        <w:rPr>
+          <w:rFonts w:eastAsia="Times New Roman" w:cs="Courier New"/>
+          <w:kern w:val="0"/>
+          <w:lang w:eastAsia="en-AU"/>
+          <w14:ligatures w14:val="none"/>
+        </w:rPr>
+        <w:t>_scan_distance = 150</w:t>
       </w:r>
     </w:p>
     <w:p>
       <w:pPr>
         <w:pStyle w:val="HTMLPreformatted"/>
-        <w:ind w:left="360"/>
-        <w:rPr>
-          <w:rFonts w:asciiTheme="minorHAnsi" w:hAnsiTheme="minorHAnsi"/>
-          <w:sz w:val="22"/>
-          <w:szCs w:val="22"/>
-        </w:rPr>
-      </w:pPr>
-      <w:r>
-        <w:rPr>
-          <w:rFonts w:asciiTheme="minorHAnsi" w:hAnsiTheme="minorHAnsi"/>
-          <w:sz w:val="22"/>
-          <w:szCs w:val="22"/>
-        </w:rPr>
-        <w:lastRenderedPageBreak/>
-        <w:t>odrv0.save_configuration</w:t>
+        <w:rPr>
+          <w:rFonts w:asciiTheme="minorHAnsi" w:hAnsiTheme="minorHAnsi"/>
+          <w:sz w:val="22"/>
+          <w:szCs w:val="22"/>
+        </w:rPr>
+      </w:pPr>
+      <w:r>
+        <w:rPr>
+          <w:rFonts w:asciiTheme="minorHAnsi" w:hAnsiTheme="minorHAnsi"/>
+          <w:sz w:val="22"/>
+          <w:szCs w:val="22"/>
+        </w:rPr>
+        <w:t>odrv0.save_</w:t>
+      </w:r>
+      <w:proofErr w:type="gramStart"/>
+      <w:r>
+        <w:rPr>
+          <w:rFonts w:asciiTheme="minorHAnsi" w:hAnsiTheme="minorHAnsi"/>
+          <w:sz w:val="22"/>
+          <w:szCs w:val="22"/>
+        </w:rPr>
+        <w:t>configuration</w:t>
       </w:r>
       <w:r>
         <w:rPr>
@@ -1255,27 +1210,9 @@
           <w:sz w:val="22"/>
           <w:szCs w:val="22"/>
         </w:rPr>
-        <w:t>()</w:t>
-      </w:r>
-    </w:p>
-    <w:p>
-      <w:pPr>
-        <w:pStyle w:val="HTMLPreformatted"/>
-        <w:ind w:left="360"/>
-        <w:rPr>
-          <w:rFonts w:asciiTheme="minorHAnsi" w:hAnsiTheme="minorHAnsi"/>
-          <w:sz w:val="22"/>
-          <w:szCs w:val="22"/>
-        </w:rPr>
-      </w:pPr>
-      <w:r>
-        <w:rPr>
-          <w:rFonts w:asciiTheme="minorHAnsi" w:hAnsiTheme="minorHAnsi"/>
-          <w:sz w:val="22"/>
-          <w:szCs w:val="22"/>
-        </w:rPr>
-        <w:t>odrv0.reboot</w:t>
-      </w:r>
+        <w:t>(</w:t>
+      </w:r>
+      <w:proofErr w:type="gramEnd"/>
       <w:r>
         <w:rPr>
           <w:rStyle w:val="o"/>
@@ -1283,8 +1220,46 @@
           <w:sz w:val="22"/>
           <w:szCs w:val="22"/>
         </w:rPr>
+        <w:t>)</w:t>
+      </w:r>
+    </w:p>
+    <w:p>
+      <w:pPr>
+        <w:pStyle w:val="HTMLPreformatted"/>
+        <w:rPr>
+          <w:rStyle w:val="o"/>
+          <w:rFonts w:asciiTheme="minorHAnsi" w:eastAsiaTheme="majorEastAsia" w:hAnsiTheme="minorHAnsi"/>
+          <w:sz w:val="22"/>
+          <w:szCs w:val="22"/>
+        </w:rPr>
+      </w:pPr>
+      <w:r>
+        <w:rPr>
+          <w:rFonts w:asciiTheme="minorHAnsi" w:hAnsiTheme="minorHAnsi"/>
+          <w:sz w:val="22"/>
+          <w:szCs w:val="22"/>
+        </w:rPr>
+        <w:t>odrv0.reboot</w:t>
+      </w:r>
+      <w:r>
+        <w:rPr>
+          <w:rStyle w:val="o"/>
+          <w:rFonts w:asciiTheme="minorHAnsi" w:eastAsiaTheme="majorEastAsia" w:hAnsiTheme="minorHAnsi"/>
+          <w:sz w:val="22"/>
+          <w:szCs w:val="22"/>
+        </w:rPr>
         <w:t>()</w:t>
       </w:r>
+    </w:p>
+    <w:p>
+      <w:pPr>
+        <w:pStyle w:val="HTMLPreformatted"/>
+        <w:rPr>
+          <w:rFonts w:asciiTheme="minorHAnsi" w:hAnsiTheme="minorHAnsi"/>
+          <w:sz w:val="22"/>
+          <w:szCs w:val="22"/>
+        </w:rPr>
+      </w:pPr>
     </w:p>
     <w:p>
       <w:pPr>
@@ -1307,22 +1282,41 @@
           <w:tab w:val="left" w:pos="14656"/>
         </w:tabs>
         <w:spacing w:after="0" w:line="240" w:lineRule="auto"/>
-        <w:ind w:left="360"/>
-        <w:rPr>
-          <w:rFonts w:eastAsia="Times New Roman" w:cs="Courier New"/>
-          <w:kern w:val="0"/>
-          <w:lang w:eastAsia="en-AU"/>
-          <w14:ligatures w14:val="none"/>
-        </w:rPr>
-      </w:pPr>
-      <w:r>
-        <w:rPr>
-          <w:rFonts w:eastAsia="Times New Roman" w:cs="Courier New"/>
-          <w:kern w:val="0"/>
-          <w:lang w:eastAsia="en-AU"/>
-          <w14:ligatures w14:val="none"/>
-        </w:rPr>
-        <w:t>odrv0.axis0.requested_state = AXIS_STATE_MOTOR_CALIBRATION</w:t>
+        <w:rPr>
+          <w:rFonts w:eastAsia="Times New Roman" w:cs="Courier New"/>
+          <w:kern w:val="0"/>
+          <w:lang w:eastAsia="en-AU"/>
+          <w14:ligatures w14:val="none"/>
+        </w:rPr>
+      </w:pPr>
+      <w:r>
+        <w:rPr>
+          <w:rFonts w:eastAsia="Times New Roman" w:cs="Courier New"/>
+          <w:kern w:val="0"/>
+          <w:lang w:eastAsia="en-AU"/>
+          <w14:ligatures w14:val="none"/>
+        </w:rPr>
+        <w:t>odrv0.axis</w:t>
+      </w:r>
+      <w:proofErr w:type="gramStart"/>
+      <w:r>
+        <w:rPr>
+          <w:rFonts w:eastAsia="Times New Roman" w:cs="Courier New"/>
+          <w:kern w:val="0"/>
+          <w:lang w:eastAsia="en-AU"/>
+          <w14:ligatures w14:val="none"/>
+        </w:rPr>
+        <w:t>0.requested</w:t>
+      </w:r>
+      <w:proofErr w:type="gramEnd"/>
+      <w:r>
+        <w:rPr>
+          <w:rFonts w:eastAsia="Times New Roman" w:cs="Courier New"/>
+          <w:kern w:val="0"/>
+          <w:lang w:eastAsia="en-AU"/>
+          <w14:ligatures w14:val="none"/>
+        </w:rPr>
+        <w:t>_state = AXIS_STATE_MOTOR_CALIBRATION</w:t>
       </w:r>
     </w:p>
     <w:p>
@@ -1346,23 +1340,33 @@
           <w:tab w:val="left" w:pos="14656"/>
         </w:tabs>
         <w:spacing w:after="0" w:line="240" w:lineRule="auto"/>
-        <w:ind w:left="360"/>
-        <w:rPr>
-          <w:rFonts w:eastAsia="Times New Roman" w:cs="Courier New"/>
-          <w:kern w:val="0"/>
-          <w:lang w:eastAsia="en-AU"/>
-          <w14:ligatures w14:val="none"/>
-        </w:rPr>
-      </w:pPr>
-      <w:r>
-        <w:rPr>
-          <w:rFonts w:eastAsia="Times New Roman" w:cs="Courier New"/>
-          <w:kern w:val="0"/>
-          <w:lang w:eastAsia="en-AU"/>
-          <w14:ligatures w14:val="none"/>
-        </w:rPr>
-        <w:t>odrv0.axis0.motor</w:t>
-      </w:r>
+        <w:rPr>
+          <w:rFonts w:eastAsia="Times New Roman" w:cs="Courier New"/>
+          <w:kern w:val="0"/>
+          <w:lang w:eastAsia="en-AU"/>
+          <w14:ligatures w14:val="none"/>
+        </w:rPr>
+      </w:pPr>
+      <w:r>
+        <w:rPr>
+          <w:rFonts w:eastAsia="Times New Roman" w:cs="Courier New"/>
+          <w:kern w:val="0"/>
+          <w:lang w:eastAsia="en-AU"/>
+          <w14:ligatures w14:val="none"/>
+        </w:rPr>
+        <w:t>odrv0.axis</w:t>
+      </w:r>
+      <w:proofErr w:type="gramStart"/>
+      <w:r>
+        <w:rPr>
+          <w:rFonts w:eastAsia="Times New Roman" w:cs="Courier New"/>
+          <w:kern w:val="0"/>
+          <w:lang w:eastAsia="en-AU"/>
+          <w14:ligatures w14:val="none"/>
+        </w:rPr>
+        <w:t>0.motor</w:t>
+      </w:r>
+      <w:proofErr w:type="gramEnd"/>
     </w:p>
     <w:p>
       <w:pPr>
@@ -1385,21 +1389,21 @@
           <w:tab w:val="left" w:pos="14656"/>
         </w:tabs>
         <w:spacing w:after="0" w:line="240" w:lineRule="auto"/>
-        <w:ind w:left="360"/>
-        <w:rPr>
-          <w:rFonts w:eastAsia="Times New Roman" w:cs="Courier New"/>
-          <w:kern w:val="0"/>
-          <w:lang w:eastAsia="en-AU"/>
-          <w14:ligatures w14:val="none"/>
-        </w:rPr>
-      </w:pPr>
-      <w:r>
-        <w:rPr>
-          <w:rFonts w:eastAsia="Times New Roman" w:cs="Courier New"/>
-          <w:kern w:val="0"/>
-          <w:lang w:eastAsia="en-AU"/>
-          <w14:ligatures w14:val="none"/>
-        </w:rPr>
+        <w:rPr>
+          <w:rFonts w:eastAsia="Times New Roman" w:cs="Courier New"/>
+          <w:kern w:val="0"/>
+          <w:lang w:eastAsia="en-AU"/>
+          <w14:ligatures w14:val="none"/>
+        </w:rPr>
+      </w:pPr>
+      <w:r>
+        <w:rPr>
+          <w:rFonts w:eastAsia="Times New Roman" w:cs="Courier New"/>
+          <w:kern w:val="0"/>
+          <w:lang w:eastAsia="en-AU"/>
+          <w14:ligatures w14:val="none"/>
+        </w:rPr>
+        <w:lastRenderedPageBreak/>
         <w:t>odrv0.axis0.motor.config.pre_calibrated = True</w:t>
       </w:r>
     </w:p>
@@ -1424,23 +1428,33 @@
           <w:tab w:val="left" w:pos="14656"/>
         </w:tabs>
         <w:spacing w:after="0" w:line="240" w:lineRule="auto"/>
-        <w:ind w:left="360"/>
-        <w:rPr>
-          <w:rFonts w:eastAsia="Times New Roman" w:cs="Courier New"/>
-          <w:kern w:val="0"/>
-          <w:lang w:eastAsia="en-AU"/>
-          <w14:ligatures w14:val="none"/>
-        </w:rPr>
-      </w:pPr>
-      <w:r>
-        <w:rPr>
-          <w:rFonts w:eastAsia="Times New Roman" w:cs="Courier New"/>
-          <w:kern w:val="0"/>
-          <w:lang w:eastAsia="en-AU"/>
-          <w14:ligatures w14:val="none"/>
-        </w:rPr>
-        <w:t>odrv0.axis0.encoder</w:t>
-      </w:r>
+        <w:rPr>
+          <w:rFonts w:eastAsia="Times New Roman" w:cs="Courier New"/>
+          <w:kern w:val="0"/>
+          <w:lang w:eastAsia="en-AU"/>
+          <w14:ligatures w14:val="none"/>
+        </w:rPr>
+      </w:pPr>
+      <w:r>
+        <w:rPr>
+          <w:rFonts w:eastAsia="Times New Roman" w:cs="Courier New"/>
+          <w:kern w:val="0"/>
+          <w:lang w:eastAsia="en-AU"/>
+          <w14:ligatures w14:val="none"/>
+        </w:rPr>
+        <w:t>odrv0.axis</w:t>
+      </w:r>
+      <w:proofErr w:type="gramStart"/>
+      <w:r>
+        <w:rPr>
+          <w:rFonts w:eastAsia="Times New Roman" w:cs="Courier New"/>
+          <w:kern w:val="0"/>
+          <w:lang w:eastAsia="en-AU"/>
+          <w14:ligatures w14:val="none"/>
+        </w:rPr>
+        <w:t>0.encoder</w:t>
+      </w:r>
+      <w:proofErr w:type="gramEnd"/>
     </w:p>
     <w:p>
       <w:pPr>
@@ -1463,419 +1477,13 @@
           <w:tab w:val="left" w:pos="14656"/>
         </w:tabs>
         <w:spacing w:after="0" w:line="240" w:lineRule="auto"/>
-        <w:ind w:left="360"/>
-        <w:rPr>
-          <w:rFonts w:eastAsia="Times New Roman" w:cs="Courier New"/>
-          <w:kern w:val="0"/>
-          <w:lang w:eastAsia="en-AU"/>
-          <w14:ligatures w14:val="none"/>
-        </w:rPr>
-      </w:pPr>
-      <w:r>
-        <w:t>odrv0.save_configuration</w:t>
-      </w:r>
-      <w:r>
-        <w:rPr>
-          <w:rStyle w:val="o"/>
-          <w:rFonts w:eastAsiaTheme="majorEastAsia"/>
-        </w:rPr>
-        <w:t>()</w:t>
-      </w:r>
-    </w:p>
-    <w:p>
-      <w:pPr>
-        <w:pStyle w:val="HTMLPreformatted"/>
-        <w:ind w:left="360"/>
-        <w:rPr>
-          <w:rFonts w:asciiTheme="minorHAnsi" w:hAnsiTheme="minorHAnsi"/>
-          <w:sz w:val="22"/>
-          <w:szCs w:val="22"/>
-        </w:rPr>
-      </w:pPr>
-      <w:r>
-        <w:rPr>
-          <w:rFonts w:asciiTheme="minorHAnsi" w:hAnsiTheme="minorHAnsi"/>
-          <w:sz w:val="22"/>
-          <w:szCs w:val="22"/>
-        </w:rPr>
-        <w:t xml:space="preserve">odrv0.axis0.requested_state </w:t>
-      </w:r>
-      <w:r>
-        <w:rPr>
-          <w:rStyle w:val="o"/>
-          <w:rFonts w:asciiTheme="minorHAnsi" w:eastAsiaTheme="majorEastAsia" w:hAnsiTheme="minorHAnsi"/>
-          <w:sz w:val="22"/>
-          <w:szCs w:val="22"/>
-        </w:rPr>
-        <w:t>=</w:t>
-      </w:r>
-      <w:r>
-        <w:rPr>
-          <w:rFonts w:asciiTheme="minorHAnsi" w:hAnsiTheme="minorHAnsi"/>
-          <w:sz w:val="22"/>
-          <w:szCs w:val="22"/>
-        </w:rPr>
-        <w:t xml:space="preserve"> AXIS_STATE_CLOSED_LOOP_CONTROL</w:t>
-      </w:r>
-    </w:p>
-    <w:p>
-      <w:pPr>
-        <w:pStyle w:val="HTMLPreformatted"/>
-        <w:ind w:left="360"/>
-        <w:rPr>
-          <w:rFonts w:asciiTheme="minorHAnsi" w:hAnsiTheme="minorHAnsi"/>
-          <w:sz w:val="22"/>
-          <w:szCs w:val="22"/>
-        </w:rPr>
-      </w:pPr>
-      <w:r>
-        <w:rPr>
-          <w:rFonts w:asciiTheme="minorHAnsi" w:hAnsiTheme="minorHAnsi"/>
-          <w:sz w:val="22"/>
-          <w:szCs w:val="22"/>
-        </w:rPr>
-        <w:t xml:space="preserve">odrv0.axis0.controller.input_vel </w:t>
-      </w:r>
-      <w:r>
-        <w:rPr>
-          <w:rStyle w:val="o"/>
-          <w:rFonts w:asciiTheme="minorHAnsi" w:eastAsiaTheme="majorEastAsia" w:hAnsiTheme="minorHAnsi"/>
-          <w:sz w:val="22"/>
-          <w:szCs w:val="22"/>
-        </w:rPr>
-        <w:t>=</w:t>
-      </w:r>
-      <w:r>
-        <w:rPr>
-          <w:rFonts w:asciiTheme="minorHAnsi" w:hAnsiTheme="minorHAnsi"/>
-          <w:sz w:val="22"/>
-          <w:szCs w:val="22"/>
-        </w:rPr>
-        <w:t xml:space="preserve"> 2</w:t>
-      </w:r>
-    </w:p>
-    <w:p>
-      <w:pPr>
-        <w:pStyle w:val="HTMLPreformatted"/>
-        <w:ind w:left="360"/>
-        <w:rPr>
-          <w:rFonts w:asciiTheme="minorHAnsi" w:hAnsiTheme="minorHAnsi"/>
-          <w:sz w:val="22"/>
-          <w:szCs w:val="22"/>
-        </w:rPr>
-      </w:pPr>
-      <w:r>
-        <w:rPr>
-          <w:rFonts w:asciiTheme="minorHAnsi" w:hAnsiTheme="minorHAnsi"/>
-          <w:sz w:val="22"/>
-          <w:szCs w:val="22"/>
-        </w:rPr>
-        <w:t>odrv0.reboot()</w:t>
-      </w:r>
-      <w:r>
-        <w:rPr>
-          <w:rFonts w:asciiTheme="minorHAnsi" w:hAnsiTheme="minorHAnsi"/>
-          <w:sz w:val="22"/>
-          <w:szCs w:val="22"/>
-        </w:rPr>
-        <w:t xml:space="preserve"> </w:t>
-      </w:r>
-    </w:p>
-    <w:p>
-      <w:pPr>
-        <w:pStyle w:val="HTMLPreformatted"/>
-        <w:rPr>
-          <w:rFonts w:asciiTheme="minorHAnsi" w:hAnsiTheme="minorHAnsi"/>
-          <w:sz w:val="22"/>
-          <w:szCs w:val="22"/>
-        </w:rPr>
-      </w:pPr>
-    </w:p>
-    <w:p>
-      <w:pPr>
-        <w:ind w:left="360"/>
-      </w:pPr>
-      <w:r>
-        <w:t>odrv0.axis</w:t>
-      </w:r>
-      <w:r>
-        <w:t>1</w:t>
-      </w:r>
-      <w:r>
-        <w:t>.motor.config.current_lim = 10</w:t>
-      </w:r>
-    </w:p>
-    <w:p>
-      <w:pPr>
-        <w:ind w:left="360"/>
-        <w:rPr>
-          <w:lang w:val="en-US"/>
-        </w:rPr>
-      </w:pPr>
-      <w:r>
-        <w:rPr>
-          <w:lang w:val="en-US"/>
-        </w:rPr>
-        <w:t>odrv0.axis</w:t>
-      </w:r>
-      <w:r>
-        <w:rPr>
-          <w:lang w:val="en-US"/>
-        </w:rPr>
-        <w:t>1</w:t>
-      </w:r>
-      <w:r>
-        <w:rPr>
-          <w:lang w:val="en-US"/>
-        </w:rPr>
-        <w:t>.controller.config.vel_limit = 2</w:t>
-      </w:r>
-    </w:p>
-    <w:p>
-      <w:pPr>
-        <w:ind w:left="360"/>
-        <w:rPr>
-          <w:lang w:val="en-US"/>
-        </w:rPr>
-      </w:pPr>
-      <w:proofErr w:type="gramStart"/>
-      <w:r>
-        <w:rPr>
-          <w:lang w:val="en-US"/>
-        </w:rPr>
-        <w:t>odrv0.config.brake</w:t>
-      </w:r>
-      <w:proofErr w:type="gramEnd"/>
-      <w:r>
-        <w:rPr>
-          <w:lang w:val="en-US"/>
-        </w:rPr>
-        <w:t>_resistance = 2</w:t>
-      </w:r>
-    </w:p>
-    <w:p>
-      <w:pPr>
-        <w:ind w:left="360"/>
-        <w:rPr>
-          <w:lang w:val="en-US"/>
-        </w:rPr>
-      </w:pPr>
-      <w:r>
-        <w:rPr>
-          <w:lang w:val="en-US"/>
-        </w:rPr>
-        <w:t>odrv0.axis</w:t>
-      </w:r>
-      <w:proofErr w:type="gramStart"/>
-      <w:r>
-        <w:rPr>
-          <w:lang w:val="en-US"/>
-        </w:rPr>
-        <w:t>1</w:t>
-      </w:r>
-      <w:r>
-        <w:rPr>
-          <w:lang w:val="en-US"/>
-        </w:rPr>
-        <w:t>.motor</w:t>
-      </w:r>
-      <w:proofErr w:type="gramEnd"/>
-      <w:r>
-        <w:rPr>
-          <w:lang w:val="en-US"/>
-        </w:rPr>
-        <w:t>.</w:t>
-      </w:r>
-      <w:proofErr w:type="gramStart"/>
-      <w:r>
-        <w:rPr>
-          <w:lang w:val="en-US"/>
-        </w:rPr>
-        <w:t>config.pole</w:t>
-      </w:r>
-      <w:proofErr w:type="gramEnd"/>
-      <w:r>
-        <w:rPr>
-          <w:lang w:val="en-US"/>
-        </w:rPr>
-        <w:t>_pairs = 4</w:t>
-      </w:r>
-    </w:p>
-    <w:p>
-      <w:pPr>
-        <w:ind w:left="360"/>
-        <w:rPr>
-          <w:lang w:val="en-US"/>
-        </w:rPr>
-      </w:pPr>
-      <w:r>
-        <w:rPr>
-          <w:lang w:val="en-US"/>
-        </w:rPr>
-        <w:t>odrv0.axis</w:t>
-      </w:r>
-      <w:proofErr w:type="gramStart"/>
-      <w:r>
-        <w:rPr>
-          <w:lang w:val="en-US"/>
-        </w:rPr>
-        <w:t>1</w:t>
-      </w:r>
-      <w:r>
-        <w:rPr>
-          <w:lang w:val="en-US"/>
-        </w:rPr>
-        <w:t>.motor</w:t>
-      </w:r>
-      <w:proofErr w:type="gramEnd"/>
-      <w:r>
-        <w:rPr>
-          <w:lang w:val="en-US"/>
-        </w:rPr>
-        <w:t>.</w:t>
-      </w:r>
-      <w:proofErr w:type="gramStart"/>
-      <w:r>
-        <w:rPr>
-          <w:lang w:val="en-US"/>
-        </w:rPr>
-        <w:t>config.torque</w:t>
-      </w:r>
-      <w:proofErr w:type="gramEnd"/>
-      <w:r>
-        <w:rPr>
-          <w:lang w:val="en-US"/>
-        </w:rPr>
-        <w:t>_constant = 0.5</w:t>
-      </w:r>
-    </w:p>
-    <w:p>
-      <w:pPr>
-        <w:ind w:left="360"/>
-        <w:rPr>
-          <w:lang w:val="en-US"/>
-        </w:rPr>
-      </w:pPr>
-      <w:r>
-        <w:rPr>
-          <w:lang w:val="en-US"/>
-        </w:rPr>
-        <w:t>odrv0.axis</w:t>
-      </w:r>
-      <w:proofErr w:type="gramStart"/>
-      <w:r>
-        <w:rPr>
-          <w:lang w:val="en-US"/>
-        </w:rPr>
-        <w:t>1</w:t>
-      </w:r>
-      <w:r>
-        <w:rPr>
-          <w:lang w:val="en-US"/>
-        </w:rPr>
-        <w:t>.motor</w:t>
-      </w:r>
-      <w:proofErr w:type="gramEnd"/>
-      <w:r>
-        <w:rPr>
-          <w:lang w:val="en-US"/>
-        </w:rPr>
-        <w:t>.</w:t>
-      </w:r>
-      <w:proofErr w:type="gramStart"/>
-      <w:r>
-        <w:rPr>
-          <w:lang w:val="en-US"/>
-        </w:rPr>
-        <w:t>config.motor</w:t>
-      </w:r>
-      <w:proofErr w:type="gramEnd"/>
-      <w:r>
-        <w:rPr>
-          <w:lang w:val="en-US"/>
-        </w:rPr>
-        <w:t>_type = 0</w:t>
-      </w:r>
-    </w:p>
-    <w:p>
-      <w:pPr>
-        <w:ind w:left="360"/>
-        <w:rPr>
-          <w:lang w:val="en-US"/>
-        </w:rPr>
-      </w:pPr>
-      <w:r>
-        <w:t>odrv0.axis</w:t>
-      </w:r>
-      <w:r>
-        <w:t>1</w:t>
-      </w:r>
-      <w:r>
-        <w:t>.encoder.config.cpr = 24</w:t>
-      </w:r>
-    </w:p>
-    <w:p>
-      <w:pPr>
-        <w:ind w:left="360"/>
-        <w:rPr>
-          <w:lang w:val="en-US"/>
-        </w:rPr>
-      </w:pPr>
-      <w:r>
-        <w:rPr>
-          <w:lang w:val="en-US"/>
-        </w:rPr>
-        <w:t>odrv0.save_</w:t>
-      </w:r>
-      <w:proofErr w:type="gramStart"/>
-      <w:r>
-        <w:rPr>
-          <w:lang w:val="en-US"/>
-        </w:rPr>
-        <w:t>configuration(</w:t>
-      </w:r>
-      <w:proofErr w:type="gramEnd"/>
-      <w:r>
-        <w:rPr>
-          <w:lang w:val="en-US"/>
-        </w:rPr>
-        <w:t>)</w:t>
-      </w:r>
-    </w:p>
-    <w:p>
-      <w:pPr>
-        <w:ind w:left="360"/>
-        <w:rPr>
-          <w:lang w:val="en-US"/>
-        </w:rPr>
-      </w:pPr>
-      <w:r>
-        <w:rPr>
-          <w:rFonts w:eastAsia="Times New Roman" w:cs="Courier New"/>
-          <w:kern w:val="0"/>
-          <w:lang w:eastAsia="en-AU"/>
-          <w14:ligatures w14:val="none"/>
-        </w:rPr>
-        <w:t>odrv0.axis</w:t>
-      </w:r>
-      <w:r>
-        <w:rPr>
-          <w:rFonts w:eastAsia="Times New Roman" w:cs="Courier New"/>
-          <w:kern w:val="0"/>
-          <w:lang w:eastAsia="en-AU"/>
-          <w14:ligatures w14:val="none"/>
-        </w:rPr>
-        <w:t>1</w:t>
-      </w:r>
-      <w:r>
-        <w:rPr>
-          <w:rFonts w:eastAsia="Times New Roman" w:cs="Courier New"/>
-          <w:kern w:val="0"/>
-          <w:lang w:eastAsia="en-AU"/>
-          <w14:ligatures w14:val="none"/>
-        </w:rPr>
-        <w:t>.encoder.config.mode = ENCODER_MODE_HALL</w:t>
-      </w:r>
+        <w:rPr>
+          <w:rFonts w:eastAsia="Times New Roman" w:cs="Courier New"/>
+          <w:kern w:val="0"/>
+          <w:lang w:eastAsia="en-AU"/>
+          <w14:ligatures w14:val="none"/>
+        </w:rPr>
+      </w:pPr>
     </w:p>
     <w:p>
       <w:pPr>
@@ -1898,49 +1506,466 @@
           <w:tab w:val="left" w:pos="14656"/>
         </w:tabs>
         <w:spacing w:after="0" w:line="240" w:lineRule="auto"/>
-        <w:ind w:left="360"/>
-        <w:rPr>
-          <w:rFonts w:eastAsia="Times New Roman" w:cs="Courier New"/>
-          <w:kern w:val="0"/>
-          <w:lang w:eastAsia="en-AU"/>
-          <w14:ligatures w14:val="none"/>
-        </w:rPr>
-      </w:pPr>
-      <w:r>
-        <w:rPr>
-          <w:rFonts w:eastAsia="Times New Roman" w:cs="Courier New"/>
-          <w:kern w:val="0"/>
-          <w:lang w:eastAsia="en-AU"/>
-          <w14:ligatures w14:val="none"/>
+        <w:rPr>
+          <w:rFonts w:eastAsia="Times New Roman" w:cs="Courier New"/>
+          <w:kern w:val="0"/>
+          <w:lang w:eastAsia="en-AU"/>
+          <w14:ligatures w14:val="none"/>
+        </w:rPr>
+      </w:pPr>
+      <w:r>
+        <w:t>odrv0.save_</w:t>
+      </w:r>
+      <w:proofErr w:type="gramStart"/>
+      <w:r>
+        <w:t>configuration</w:t>
+      </w:r>
+      <w:r>
+        <w:rPr>
+          <w:rStyle w:val="o"/>
+          <w:rFonts w:eastAsiaTheme="majorEastAsia"/>
+        </w:rPr>
+        <w:t>(</w:t>
+      </w:r>
+      <w:proofErr w:type="gramEnd"/>
+      <w:r>
+        <w:rPr>
+          <w:rStyle w:val="o"/>
+          <w:rFonts w:eastAsiaTheme="majorEastAsia"/>
+        </w:rPr>
+        <w:t>)</w:t>
+      </w:r>
+    </w:p>
+    <w:p>
+      <w:pPr>
+        <w:pStyle w:val="HTMLPreformatted"/>
+        <w:rPr>
+          <w:rFonts w:asciiTheme="minorHAnsi" w:hAnsiTheme="minorHAnsi"/>
+          <w:sz w:val="22"/>
+          <w:szCs w:val="22"/>
+        </w:rPr>
+      </w:pPr>
+      <w:r>
+        <w:rPr>
+          <w:rFonts w:asciiTheme="minorHAnsi" w:hAnsiTheme="minorHAnsi"/>
+          <w:sz w:val="22"/>
+          <w:szCs w:val="22"/>
         </w:rPr>
         <w:t>odrv0.axis</w:t>
       </w:r>
-      <w:r>
-        <w:rPr>
-          <w:rFonts w:eastAsia="Times New Roman" w:cs="Courier New"/>
-          <w:kern w:val="0"/>
-          <w:lang w:eastAsia="en-AU"/>
-          <w14:ligatures w14:val="none"/>
+      <w:proofErr w:type="gramStart"/>
+      <w:r>
+        <w:rPr>
+          <w:rFonts w:asciiTheme="minorHAnsi" w:hAnsiTheme="minorHAnsi"/>
+          <w:sz w:val="22"/>
+          <w:szCs w:val="22"/>
+        </w:rPr>
+        <w:t>0.requested</w:t>
+      </w:r>
+      <w:proofErr w:type="gramEnd"/>
+      <w:r>
+        <w:rPr>
+          <w:rFonts w:asciiTheme="minorHAnsi" w:hAnsiTheme="minorHAnsi"/>
+          <w:sz w:val="22"/>
+          <w:szCs w:val="22"/>
+        </w:rPr>
+        <w:t xml:space="preserve">_state </w:t>
+      </w:r>
+      <w:r>
+        <w:rPr>
+          <w:rStyle w:val="o"/>
+          <w:rFonts w:asciiTheme="minorHAnsi" w:eastAsiaTheme="majorEastAsia" w:hAnsiTheme="minorHAnsi"/>
+          <w:sz w:val="22"/>
+          <w:szCs w:val="22"/>
+        </w:rPr>
+        <w:t>=</w:t>
+      </w:r>
+      <w:r>
+        <w:rPr>
+          <w:rFonts w:asciiTheme="minorHAnsi" w:hAnsiTheme="minorHAnsi"/>
+          <w:sz w:val="22"/>
+          <w:szCs w:val="22"/>
+        </w:rPr>
+        <w:t xml:space="preserve"> AXIS_STATE_CLOSED_LOOP_CONTROL</w:t>
+      </w:r>
+    </w:p>
+    <w:p>
+      <w:pPr>
+        <w:pStyle w:val="HTMLPreformatted"/>
+        <w:rPr>
+          <w:rFonts w:asciiTheme="minorHAnsi" w:hAnsiTheme="minorHAnsi"/>
+          <w:sz w:val="22"/>
+          <w:szCs w:val="22"/>
+        </w:rPr>
+      </w:pPr>
+      <w:r>
+        <w:rPr>
+          <w:rFonts w:asciiTheme="minorHAnsi" w:hAnsiTheme="minorHAnsi"/>
+          <w:sz w:val="22"/>
+          <w:szCs w:val="22"/>
+        </w:rPr>
+        <w:t>odrv0.axis</w:t>
+      </w:r>
+      <w:proofErr w:type="gramStart"/>
+      <w:r>
+        <w:rPr>
+          <w:rFonts w:asciiTheme="minorHAnsi" w:hAnsiTheme="minorHAnsi"/>
+          <w:sz w:val="22"/>
+          <w:szCs w:val="22"/>
+        </w:rPr>
+        <w:t>0.controller</w:t>
+      </w:r>
+      <w:proofErr w:type="gramEnd"/>
+      <w:r>
+        <w:rPr>
+          <w:rFonts w:asciiTheme="minorHAnsi" w:hAnsiTheme="minorHAnsi"/>
+          <w:sz w:val="22"/>
+          <w:szCs w:val="22"/>
+        </w:rPr>
+        <w:t xml:space="preserve">.input_vel </w:t>
+      </w:r>
+      <w:r>
+        <w:rPr>
+          <w:rStyle w:val="o"/>
+          <w:rFonts w:asciiTheme="minorHAnsi" w:eastAsiaTheme="majorEastAsia" w:hAnsiTheme="minorHAnsi"/>
+          <w:sz w:val="22"/>
+          <w:szCs w:val="22"/>
+        </w:rPr>
+        <w:t>=</w:t>
+      </w:r>
+      <w:r>
+        <w:rPr>
+          <w:rFonts w:asciiTheme="minorHAnsi" w:hAnsiTheme="minorHAnsi"/>
+          <w:sz w:val="22"/>
+          <w:szCs w:val="22"/>
+        </w:rPr>
+        <w:t xml:space="preserve"> 2</w:t>
+      </w:r>
+    </w:p>
+    <w:p>
+      <w:pPr>
+        <w:pStyle w:val="HTMLPreformatted"/>
+        <w:rPr>
+          <w:rFonts w:asciiTheme="minorHAnsi" w:hAnsiTheme="minorHAnsi"/>
+          <w:sz w:val="22"/>
+          <w:szCs w:val="22"/>
+        </w:rPr>
+      </w:pPr>
+      <w:r>
+        <w:rPr>
+          <w:rFonts w:asciiTheme="minorHAnsi" w:hAnsiTheme="minorHAnsi"/>
+          <w:sz w:val="22"/>
+          <w:szCs w:val="22"/>
+        </w:rPr>
+        <w:t>odrv0.reboot()</w:t>
+      </w:r>
+      <w:r>
+        <w:rPr>
+          <w:rFonts w:asciiTheme="minorHAnsi" w:hAnsiTheme="minorHAnsi"/>
+          <w:sz w:val="22"/>
+          <w:szCs w:val="22"/>
+        </w:rPr>
+        <w:t xml:space="preserve"> </w:t>
+      </w:r>
+    </w:p>
+    <w:p>
+      <w:pPr>
+        <w:pStyle w:val="HTMLPreformatted"/>
+        <w:rPr>
+          <w:rFonts w:asciiTheme="minorHAnsi" w:hAnsiTheme="minorHAnsi"/>
+          <w:sz w:val="22"/>
+          <w:szCs w:val="22"/>
+        </w:rPr>
+      </w:pPr>
+    </w:p>
+    <w:p>
+      <w:pPr>
+        <w:pStyle w:val="HTMLPreformatted"/>
+        <w:rPr>
+          <w:rFonts w:asciiTheme="minorHAnsi" w:hAnsiTheme="minorHAnsi"/>
+          <w:sz w:val="22"/>
+          <w:szCs w:val="22"/>
+        </w:rPr>
+      </w:pPr>
+      <w:r>
+        <w:rPr>
+          <w:rFonts w:asciiTheme="minorHAnsi" w:hAnsiTheme="minorHAnsi"/>
+          <w:b/>
+          <w:bCs/>
+          <w:sz w:val="22"/>
+          <w:szCs w:val="22"/>
+        </w:rPr>
+        <w:t xml:space="preserve">Axis </w:t>
+      </w:r>
+      <w:r>
+        <w:rPr>
+          <w:rFonts w:asciiTheme="minorHAnsi" w:hAnsiTheme="minorHAnsi"/>
+          <w:b/>
+          <w:bCs/>
+          <w:sz w:val="22"/>
+          <w:szCs w:val="22"/>
         </w:rPr>
         <w:t>1</w:t>
       </w:r>
       <w:r>
         <w:rPr>
-          <w:rFonts w:eastAsia="Times New Roman" w:cs="Courier New"/>
-          <w:kern w:val="0"/>
-          <w:lang w:eastAsia="en-AU"/>
-          <w14:ligatures w14:val="none"/>
-        </w:rPr>
-        <w:t xml:space="preserve">.encoder.config.cpr = </w:t>
-      </w:r>
-      <w:r>
-        <w:rPr>
-          <w:rFonts w:eastAsia="Times New Roman" w:cs="Courier New"/>
-          <w:kern w:val="0"/>
-          <w:lang w:eastAsia="en-AU"/>
-          <w14:ligatures w14:val="none"/>
-        </w:rPr>
-        <w:t>24</w:t>
+          <w:rFonts w:asciiTheme="minorHAnsi" w:hAnsiTheme="minorHAnsi"/>
+          <w:b/>
+          <w:bCs/>
+          <w:sz w:val="22"/>
+          <w:szCs w:val="22"/>
+        </w:rPr>
+        <w:t xml:space="preserve"> -</w:t>
+      </w:r>
+    </w:p>
+    <w:p>
+      <w:pPr>
+        <w:spacing w:after="0" w:line="240" w:lineRule="auto"/>
+      </w:pPr>
+      <w:r>
+        <w:t>odrv0.axis</w:t>
+      </w:r>
+      <w:proofErr w:type="gramStart"/>
+      <w:r>
+        <w:t>1</w:t>
+      </w:r>
+      <w:r>
+        <w:t>.motor</w:t>
+      </w:r>
+      <w:proofErr w:type="gramEnd"/>
+      <w:r>
+        <w:t>.</w:t>
+      </w:r>
+      <w:proofErr w:type="gramStart"/>
+      <w:r>
+        <w:t>config.current</w:t>
+      </w:r>
+      <w:proofErr w:type="gramEnd"/>
+      <w:r>
+        <w:t>_lim = 10</w:t>
+      </w:r>
+    </w:p>
+    <w:p>
+      <w:pPr>
+        <w:spacing w:after="0" w:line="240" w:lineRule="auto"/>
+        <w:rPr>
+          <w:lang w:val="en-US"/>
+        </w:rPr>
+      </w:pPr>
+      <w:r>
+        <w:rPr>
+          <w:lang w:val="en-US"/>
+        </w:rPr>
+        <w:t>odrv0.axis</w:t>
+      </w:r>
+      <w:r>
+        <w:rPr>
+          <w:lang w:val="en-US"/>
+        </w:rPr>
+        <w:t>1</w:t>
+      </w:r>
+      <w:r>
+        <w:rPr>
+          <w:lang w:val="en-US"/>
+        </w:rPr>
+        <w:t>.controller.config.vel_limit = 2</w:t>
+      </w:r>
+    </w:p>
+    <w:p>
+      <w:pPr>
+        <w:spacing w:after="0" w:line="240" w:lineRule="auto"/>
+        <w:rPr>
+          <w:lang w:val="en-US"/>
+        </w:rPr>
+      </w:pPr>
+      <w:r>
+        <w:rPr>
+          <w:lang w:val="en-US"/>
+        </w:rPr>
+        <w:t>odrv0.config.brake_resistance = 2</w:t>
+      </w:r>
+    </w:p>
+    <w:p>
+      <w:pPr>
+        <w:spacing w:after="0" w:line="240" w:lineRule="auto"/>
+        <w:rPr>
+          <w:lang w:val="en-US"/>
+        </w:rPr>
+      </w:pPr>
+      <w:r>
+        <w:rPr>
+          <w:lang w:val="en-US"/>
+        </w:rPr>
+        <w:t>odrv0.axis</w:t>
+      </w:r>
+      <w:r>
+        <w:rPr>
+          <w:lang w:val="en-US"/>
+        </w:rPr>
+        <w:t>1</w:t>
+      </w:r>
+      <w:r>
+        <w:rPr>
+          <w:lang w:val="en-US"/>
+        </w:rPr>
+        <w:t>.motor.config.pole_pairs = 4</w:t>
+      </w:r>
+    </w:p>
+    <w:p>
+      <w:pPr>
+        <w:spacing w:after="0" w:line="240" w:lineRule="auto"/>
+        <w:rPr>
+          <w:lang w:val="en-US"/>
+        </w:rPr>
+      </w:pPr>
+      <w:r>
+        <w:rPr>
+          <w:lang w:val="en-US"/>
+        </w:rPr>
+        <w:t>odrv0.axis</w:t>
+      </w:r>
+      <w:r>
+        <w:rPr>
+          <w:lang w:val="en-US"/>
+        </w:rPr>
+        <w:t>1</w:t>
+      </w:r>
+      <w:r>
+        <w:rPr>
+          <w:lang w:val="en-US"/>
+        </w:rPr>
+        <w:t>.motor.config.torque_constant = 0.5</w:t>
+      </w:r>
+    </w:p>
+    <w:p>
+      <w:pPr>
+        <w:spacing w:after="0" w:line="240" w:lineRule="auto"/>
+        <w:rPr>
+          <w:lang w:val="en-US"/>
+        </w:rPr>
+      </w:pPr>
+      <w:r>
+        <w:rPr>
+          <w:lang w:val="en-US"/>
+        </w:rPr>
+        <w:t>odrv0.axis</w:t>
+      </w:r>
+      <w:r>
+        <w:rPr>
+          <w:lang w:val="en-US"/>
+        </w:rPr>
+        <w:t>1</w:t>
+      </w:r>
+      <w:r>
+        <w:rPr>
+          <w:lang w:val="en-US"/>
+        </w:rPr>
+        <w:t>.motor.config.motor_type = 0</w:t>
+      </w:r>
+    </w:p>
+    <w:p>
+      <w:pPr>
+        <w:spacing w:after="0" w:line="240" w:lineRule="auto"/>
+        <w:rPr>
+          <w:lang w:val="en-US"/>
+        </w:rPr>
+      </w:pPr>
+      <w:r>
+        <w:t>odrv0.axis</w:t>
+      </w:r>
+      <w:r>
+        <w:t>1</w:t>
+      </w:r>
+      <w:r>
+        <w:t>.encoder.config.cpr = 24</w:t>
+      </w:r>
+    </w:p>
+    <w:p>
+      <w:pPr>
+        <w:spacing w:after="0" w:line="240" w:lineRule="auto"/>
+        <w:rPr>
+          <w:lang w:val="en-US"/>
+        </w:rPr>
+      </w:pPr>
+      <w:r>
+        <w:rPr>
+          <w:lang w:val="en-US"/>
+        </w:rPr>
+        <w:t>odrv0.save_configuration()</w:t>
+      </w:r>
+    </w:p>
+    <w:p>
+      <w:pPr>
+        <w:spacing w:after="0" w:line="240" w:lineRule="auto"/>
+        <w:rPr>
+          <w:lang w:val="en-US"/>
+        </w:rPr>
+      </w:pPr>
+    </w:p>
+    <w:p>
+      <w:pPr>
+        <w:spacing w:after="0" w:line="240" w:lineRule="auto"/>
+        <w:rPr>
+          <w:lang w:val="en-US"/>
+        </w:rPr>
+      </w:pPr>
+      <w:r>
+        <w:rPr>
+          <w:rFonts w:eastAsia="Times New Roman" w:cs="Courier New"/>
+          <w:kern w:val="0"/>
+          <w:lang w:eastAsia="en-AU"/>
+          <w14:ligatures w14:val="none"/>
+        </w:rPr>
+        <w:t>odrv0.axis</w:t>
+      </w:r>
+      <w:proofErr w:type="gramStart"/>
+      <w:r>
+        <w:rPr>
+          <w:rFonts w:eastAsia="Times New Roman" w:cs="Courier New"/>
+          <w:kern w:val="0"/>
+          <w:lang w:eastAsia="en-AU"/>
+          <w14:ligatures w14:val="none"/>
+        </w:rPr>
+        <w:t>1</w:t>
+      </w:r>
+      <w:r>
+        <w:rPr>
+          <w:rFonts w:eastAsia="Times New Roman" w:cs="Courier New"/>
+          <w:kern w:val="0"/>
+          <w:lang w:eastAsia="en-AU"/>
+          <w14:ligatures w14:val="none"/>
+        </w:rPr>
+        <w:t>.encoder</w:t>
+      </w:r>
+      <w:proofErr w:type="gramEnd"/>
+      <w:r>
+        <w:rPr>
+          <w:rFonts w:eastAsia="Times New Roman" w:cs="Courier New"/>
+          <w:kern w:val="0"/>
+          <w:lang w:eastAsia="en-AU"/>
+          <w14:ligatures w14:val="none"/>
+        </w:rPr>
+        <w:t>.</w:t>
+      </w:r>
+      <w:proofErr w:type="gramStart"/>
+      <w:r>
+        <w:rPr>
+          <w:rFonts w:eastAsia="Times New Roman" w:cs="Courier New"/>
+          <w:kern w:val="0"/>
+          <w:lang w:eastAsia="en-AU"/>
+          <w14:ligatures w14:val="none"/>
+        </w:rPr>
+        <w:t>config.mode</w:t>
+      </w:r>
+      <w:proofErr w:type="gramEnd"/>
+      <w:r>
+        <w:rPr>
+          <w:rFonts w:eastAsia="Times New Roman" w:cs="Courier New"/>
+          <w:kern w:val="0"/>
+          <w:lang w:eastAsia="en-AU"/>
+          <w14:ligatures w14:val="none"/>
+        </w:rPr>
+        <w:t xml:space="preserve"> = ENCODER_MODE_HALL</w:t>
       </w:r>
     </w:p>
     <w:p>
@@ -1964,7 +1989,6 @@
           <w:tab w:val="left" w:pos="14656"/>
         </w:tabs>
         <w:spacing w:after="0" w:line="240" w:lineRule="auto"/>
-        <w:ind w:left="360"/>
         <w:rPr>
           <w:rFonts w:eastAsia="Times New Roman" w:cs="Courier New"/>
           <w:kern w:val="0"/>
@@ -1997,63 +2021,16 @@
           <w:lang w:eastAsia="en-AU"/>
           <w14:ligatures w14:val="none"/>
         </w:rPr>
-        <w:t>.encoder.config.calib_scan_distance = 150</w:t>
-      </w:r>
-    </w:p>
-    <w:p>
-      <w:pPr>
-        <w:pStyle w:val="HTMLPreformatted"/>
-        <w:ind w:left="360"/>
-        <w:rPr>
-          <w:rFonts w:asciiTheme="minorHAnsi" w:hAnsiTheme="minorHAnsi"/>
-          <w:sz w:val="22"/>
-          <w:szCs w:val="22"/>
-        </w:rPr>
-      </w:pPr>
-      <w:r>
-        <w:rPr>
-          <w:rFonts w:asciiTheme="minorHAnsi" w:hAnsiTheme="minorHAnsi"/>
-          <w:sz w:val="22"/>
-          <w:szCs w:val="22"/>
-        </w:rPr>
-        <w:t>odrv0.save_configuration</w:t>
-      </w:r>
-      <w:r>
-        <w:rPr>
-          <w:rStyle w:val="o"/>
-          <w:rFonts w:asciiTheme="minorHAnsi" w:eastAsiaTheme="majorEastAsia" w:hAnsiTheme="minorHAnsi"/>
-          <w:sz w:val="22"/>
-          <w:szCs w:val="22"/>
-        </w:rPr>
-        <w:t>()</w:t>
-      </w:r>
-    </w:p>
-    <w:p>
-      <w:pPr>
-        <w:pStyle w:val="HTMLPreformatted"/>
-        <w:ind w:left="360"/>
-        <w:rPr>
-          <w:rFonts w:asciiTheme="minorHAnsi" w:hAnsiTheme="minorHAnsi"/>
-          <w:sz w:val="22"/>
-          <w:szCs w:val="22"/>
-        </w:rPr>
-      </w:pPr>
-      <w:r>
-        <w:rPr>
-          <w:rFonts w:asciiTheme="minorHAnsi" w:hAnsiTheme="minorHAnsi"/>
-          <w:sz w:val="22"/>
-          <w:szCs w:val="22"/>
-        </w:rPr>
-        <w:t>odrv0.reboot</w:t>
-      </w:r>
-      <w:r>
-        <w:rPr>
-          <w:rStyle w:val="o"/>
-          <w:rFonts w:asciiTheme="minorHAnsi" w:eastAsiaTheme="majorEastAsia" w:hAnsiTheme="minorHAnsi"/>
-          <w:sz w:val="22"/>
-          <w:szCs w:val="22"/>
-        </w:rPr>
-        <w:t>()</w:t>
+        <w:t xml:space="preserve">.encoder.config.cpr = </w:t>
+      </w:r>
+      <w:r>
+        <w:rPr>
+          <w:rFonts w:eastAsia="Times New Roman" w:cs="Courier New"/>
+          <w:kern w:val="0"/>
+          <w:lang w:eastAsia="en-AU"/>
+          <w14:ligatures w14:val="none"/>
+        </w:rPr>
+        <w:t>24</w:t>
       </w:r>
     </w:p>
     <w:p>
@@ -2077,7 +2054,6 @@
           <w:tab w:val="left" w:pos="14656"/>
         </w:tabs>
         <w:spacing w:after="0" w:line="240" w:lineRule="auto"/>
-        <w:ind w:left="360"/>
         <w:rPr>
           <w:rFonts w:eastAsia="Times New Roman" w:cs="Courier New"/>
           <w:kern w:val="0"/>
@@ -2094,6 +2070,7 @@
         </w:rPr>
         <w:t>odrv0.axis</w:t>
       </w:r>
+      <w:proofErr w:type="gramStart"/>
       <w:r>
         <w:rPr>
           <w:rFonts w:eastAsia="Times New Roman" w:cs="Courier New"/>
@@ -2110,8 +2087,122 @@
           <w:lang w:eastAsia="en-AU"/>
           <w14:ligatures w14:val="none"/>
         </w:rPr>
-        <w:t>.requested_state = AXIS_STATE_MOTOR_CALIBRATION</w:t>
-      </w:r>
+        <w:t>.encoder</w:t>
+      </w:r>
+      <w:proofErr w:type="gramEnd"/>
+      <w:r>
+        <w:rPr>
+          <w:rFonts w:eastAsia="Times New Roman" w:cs="Courier New"/>
+          <w:kern w:val="0"/>
+          <w:lang w:eastAsia="en-AU"/>
+          <w14:ligatures w14:val="none"/>
+        </w:rPr>
+        <w:t>.</w:t>
+      </w:r>
+      <w:proofErr w:type="gramStart"/>
+      <w:r>
+        <w:rPr>
+          <w:rFonts w:eastAsia="Times New Roman" w:cs="Courier New"/>
+          <w:kern w:val="0"/>
+          <w:lang w:eastAsia="en-AU"/>
+          <w14:ligatures w14:val="none"/>
+        </w:rPr>
+        <w:t>config.calib</w:t>
+      </w:r>
+      <w:proofErr w:type="gramEnd"/>
+      <w:r>
+        <w:rPr>
+          <w:rFonts w:eastAsia="Times New Roman" w:cs="Courier New"/>
+          <w:kern w:val="0"/>
+          <w:lang w:eastAsia="en-AU"/>
+          <w14:ligatures w14:val="none"/>
+        </w:rPr>
+        <w:t>_scan_distance = 150</w:t>
+      </w:r>
+    </w:p>
+    <w:p>
+      <w:pPr>
+        <w:pStyle w:val="HTMLPreformatted"/>
+        <w:rPr>
+          <w:rFonts w:asciiTheme="minorHAnsi" w:hAnsiTheme="minorHAnsi"/>
+          <w:sz w:val="22"/>
+          <w:szCs w:val="22"/>
+        </w:rPr>
+      </w:pPr>
+      <w:r>
+        <w:rPr>
+          <w:rFonts w:asciiTheme="minorHAnsi" w:hAnsiTheme="minorHAnsi"/>
+          <w:sz w:val="22"/>
+          <w:szCs w:val="22"/>
+        </w:rPr>
+        <w:t>odrv0.save_</w:t>
+      </w:r>
+      <w:proofErr w:type="gramStart"/>
+      <w:r>
+        <w:rPr>
+          <w:rFonts w:asciiTheme="minorHAnsi" w:hAnsiTheme="minorHAnsi"/>
+          <w:sz w:val="22"/>
+          <w:szCs w:val="22"/>
+        </w:rPr>
+        <w:t>configuration</w:t>
+      </w:r>
+      <w:r>
+        <w:rPr>
+          <w:rStyle w:val="o"/>
+          <w:rFonts w:asciiTheme="minorHAnsi" w:eastAsiaTheme="majorEastAsia" w:hAnsiTheme="minorHAnsi"/>
+          <w:sz w:val="22"/>
+          <w:szCs w:val="22"/>
+        </w:rPr>
+        <w:t>(</w:t>
+      </w:r>
+      <w:proofErr w:type="gramEnd"/>
+      <w:r>
+        <w:rPr>
+          <w:rStyle w:val="o"/>
+          <w:rFonts w:asciiTheme="minorHAnsi" w:eastAsiaTheme="majorEastAsia" w:hAnsiTheme="minorHAnsi"/>
+          <w:sz w:val="22"/>
+          <w:szCs w:val="22"/>
+        </w:rPr>
+        <w:t>)</w:t>
+      </w:r>
+    </w:p>
+    <w:p>
+      <w:pPr>
+        <w:pStyle w:val="HTMLPreformatted"/>
+        <w:rPr>
+          <w:rStyle w:val="o"/>
+          <w:rFonts w:asciiTheme="minorHAnsi" w:eastAsiaTheme="majorEastAsia" w:hAnsiTheme="minorHAnsi"/>
+          <w:sz w:val="22"/>
+          <w:szCs w:val="22"/>
+        </w:rPr>
+      </w:pPr>
+      <w:r>
+        <w:rPr>
+          <w:rFonts w:asciiTheme="minorHAnsi" w:hAnsiTheme="minorHAnsi"/>
+          <w:sz w:val="22"/>
+          <w:szCs w:val="22"/>
+        </w:rPr>
+        <w:t>odrv0.reboot</w:t>
+      </w:r>
+      <w:r>
+        <w:rPr>
+          <w:rStyle w:val="o"/>
+          <w:rFonts w:asciiTheme="minorHAnsi" w:eastAsiaTheme="majorEastAsia" w:hAnsiTheme="minorHAnsi"/>
+          <w:sz w:val="22"/>
+          <w:szCs w:val="22"/>
+        </w:rPr>
+        <w:t>()</w:t>
+      </w:r>
+    </w:p>
+    <w:p>
+      <w:pPr>
+        <w:pStyle w:val="HTMLPreformatted"/>
+        <w:rPr>
+          <w:rFonts w:asciiTheme="minorHAnsi" w:hAnsiTheme="minorHAnsi"/>
+          <w:sz w:val="22"/>
+          <w:szCs w:val="22"/>
+        </w:rPr>
+      </w:pPr>
     </w:p>
     <w:p>
       <w:pPr>
@@ -2134,7 +2225,6 @@
           <w:tab w:val="left" w:pos="14656"/>
         </w:tabs>
         <w:spacing w:after="0" w:line="240" w:lineRule="auto"/>
-        <w:ind w:left="360"/>
         <w:rPr>
           <w:rFonts w:eastAsia="Times New Roman" w:cs="Courier New"/>
           <w:kern w:val="0"/>
@@ -2151,6 +2241,7 @@
         </w:rPr>
         <w:t>odrv0.axis</w:t>
       </w:r>
+      <w:proofErr w:type="gramStart"/>
       <w:r>
         <w:rPr>
           <w:rFonts w:eastAsia="Times New Roman" w:cs="Courier New"/>
@@ -2167,7 +2258,17 @@
           <w:lang w:eastAsia="en-AU"/>
           <w14:ligatures w14:val="none"/>
         </w:rPr>
-        <w:t>.motor</w:t>
+        <w:t>.requested</w:t>
+      </w:r>
+      <w:proofErr w:type="gramEnd"/>
+      <w:r>
+        <w:rPr>
+          <w:rFonts w:eastAsia="Times New Roman" w:cs="Courier New"/>
+          <w:kern w:val="0"/>
+          <w:lang w:eastAsia="en-AU"/>
+          <w14:ligatures w14:val="none"/>
+        </w:rPr>
+        <w:t>_state = AXIS_STATE_MOTOR_CALIBRATION</w:t>
       </w:r>
     </w:p>
     <w:p>
@@ -2191,7 +2292,6 @@
           <w:tab w:val="left" w:pos="14656"/>
         </w:tabs>
         <w:spacing w:after="0" w:line="240" w:lineRule="auto"/>
-        <w:ind w:left="360"/>
         <w:rPr>
           <w:rFonts w:eastAsia="Times New Roman" w:cs="Courier New"/>
           <w:kern w:val="0"/>
@@ -2208,6 +2308,7 @@
         </w:rPr>
         <w:t>odrv0.axis</w:t>
       </w:r>
+      <w:proofErr w:type="gramStart"/>
       <w:r>
         <w:rPr>
           <w:rFonts w:eastAsia="Times New Roman" w:cs="Courier New"/>
@@ -2224,8 +2325,9 @@
           <w:lang w:eastAsia="en-AU"/>
           <w14:ligatures w14:val="none"/>
         </w:rPr>
-        <w:t>.motor.config.pre_calibrated = True</w:t>
-      </w:r>
+        <w:t>.motor</w:t>
+      </w:r>
+      <w:proofErr w:type="gramEnd"/>
     </w:p>
     <w:p>
       <w:pPr>
@@ -2248,7 +2350,6 @@
           <w:tab w:val="left" w:pos="14656"/>
         </w:tabs>
         <w:spacing w:after="0" w:line="240" w:lineRule="auto"/>
-        <w:ind w:left="360"/>
         <w:rPr>
           <w:rFonts w:eastAsia="Times New Roman" w:cs="Courier New"/>
           <w:kern w:val="0"/>
@@ -2281,7 +2382,7 @@
           <w:lang w:eastAsia="en-AU"/>
           <w14:ligatures w14:val="none"/>
         </w:rPr>
-        <w:t>.encoder</w:t>
+        <w:t>.motor.config.pre_calibrated = True</w:t>
       </w:r>
     </w:p>
     <w:p>
@@ -2305,29 +2406,121 @@
           <w:tab w:val="left" w:pos="14656"/>
         </w:tabs>
         <w:spacing w:after="0" w:line="240" w:lineRule="auto"/>
-        <w:ind w:left="360"/>
-        <w:rPr>
-          <w:rFonts w:eastAsia="Times New Roman" w:cs="Courier New"/>
-          <w:kern w:val="0"/>
-          <w:lang w:eastAsia="en-AU"/>
-          <w14:ligatures w14:val="none"/>
-        </w:rPr>
-      </w:pPr>
-      <w:r>
-        <w:t>odrv0.save_configuration</w:t>
-      </w:r>
-      <w:r>
+        <w:rPr>
+          <w:rFonts w:eastAsia="Times New Roman" w:cs="Courier New"/>
+          <w:kern w:val="0"/>
+          <w:lang w:eastAsia="en-AU"/>
+          <w14:ligatures w14:val="none"/>
+        </w:rPr>
+      </w:pPr>
+      <w:r>
+        <w:rPr>
+          <w:rFonts w:eastAsia="Times New Roman" w:cs="Courier New"/>
+          <w:kern w:val="0"/>
+          <w:lang w:eastAsia="en-AU"/>
+          <w14:ligatures w14:val="none"/>
+        </w:rPr>
+        <w:t>odrv0.axis</w:t>
+      </w:r>
+      <w:proofErr w:type="gramStart"/>
+      <w:r>
+        <w:rPr>
+          <w:rFonts w:eastAsia="Times New Roman" w:cs="Courier New"/>
+          <w:kern w:val="0"/>
+          <w:lang w:eastAsia="en-AU"/>
+          <w14:ligatures w14:val="none"/>
+        </w:rPr>
+        <w:t>1</w:t>
+      </w:r>
+      <w:r>
+        <w:rPr>
+          <w:rFonts w:eastAsia="Times New Roman" w:cs="Courier New"/>
+          <w:kern w:val="0"/>
+          <w:lang w:eastAsia="en-AU"/>
+          <w14:ligatures w14:val="none"/>
+        </w:rPr>
+        <w:t>.encoder</w:t>
+      </w:r>
+      <w:proofErr w:type="gramEnd"/>
+    </w:p>
+    <w:p>
+      <w:pPr>
+        <w:tabs>
+          <w:tab w:val="left" w:pos="916"/>
+          <w:tab w:val="left" w:pos="1832"/>
+          <w:tab w:val="left" w:pos="2748"/>
+          <w:tab w:val="left" w:pos="3664"/>
+          <w:tab w:val="left" w:pos="4580"/>
+          <w:tab w:val="left" w:pos="5496"/>
+          <w:tab w:val="left" w:pos="6412"/>
+          <w:tab w:val="left" w:pos="7328"/>
+          <w:tab w:val="left" w:pos="8244"/>
+          <w:tab w:val="left" w:pos="9160"/>
+          <w:tab w:val="left" w:pos="10076"/>
+          <w:tab w:val="left" w:pos="10992"/>
+          <w:tab w:val="left" w:pos="11908"/>
+          <w:tab w:val="left" w:pos="12824"/>
+          <w:tab w:val="left" w:pos="13740"/>
+          <w:tab w:val="left" w:pos="14656"/>
+        </w:tabs>
+        <w:spacing w:after="0" w:line="240" w:lineRule="auto"/>
         <w:rPr>
           <w:rStyle w:val="o"/>
           <w:rFonts w:eastAsiaTheme="majorEastAsia"/>
         </w:rPr>
-        <w:t>()</w:t>
-      </w:r>
+      </w:pPr>
+      <w:r>
+        <w:t>odrv0.save_</w:t>
+      </w:r>
+      <w:proofErr w:type="gramStart"/>
+      <w:r>
+        <w:t>configuration</w:t>
+      </w:r>
+      <w:r>
+        <w:rPr>
+          <w:rStyle w:val="o"/>
+          <w:rFonts w:eastAsiaTheme="majorEastAsia"/>
+        </w:rPr>
+        <w:t>(</w:t>
+      </w:r>
+      <w:proofErr w:type="gramEnd"/>
+      <w:r>
+        <w:rPr>
+          <w:rStyle w:val="o"/>
+          <w:rFonts w:eastAsiaTheme="majorEastAsia"/>
+        </w:rPr>
+        <w:t>)</w:t>
+      </w:r>
+    </w:p>
+    <w:p>
+      <w:pPr>
+        <w:tabs>
+          <w:tab w:val="left" w:pos="916"/>
+          <w:tab w:val="left" w:pos="1832"/>
+          <w:tab w:val="left" w:pos="2748"/>
+          <w:tab w:val="left" w:pos="3664"/>
+          <w:tab w:val="left" w:pos="4580"/>
+          <w:tab w:val="left" w:pos="5496"/>
+          <w:tab w:val="left" w:pos="6412"/>
+          <w:tab w:val="left" w:pos="7328"/>
+          <w:tab w:val="left" w:pos="8244"/>
+          <w:tab w:val="left" w:pos="9160"/>
+          <w:tab w:val="left" w:pos="10076"/>
+          <w:tab w:val="left" w:pos="10992"/>
+          <w:tab w:val="left" w:pos="11908"/>
+          <w:tab w:val="left" w:pos="12824"/>
+          <w:tab w:val="left" w:pos="13740"/>
+          <w:tab w:val="left" w:pos="14656"/>
+        </w:tabs>
+        <w:spacing w:after="0" w:line="240" w:lineRule="auto"/>
+        <w:rPr>
+          <w:rFonts w:eastAsiaTheme="majorEastAsia"/>
+        </w:rPr>
+      </w:pPr>
     </w:p>
     <w:p>
       <w:pPr>
         <w:pStyle w:val="HTMLPreformatted"/>
-        <w:ind w:left="360"/>
         <w:rPr>
           <w:rFonts w:asciiTheme="minorHAnsi" w:hAnsiTheme="minorHAnsi"/>
           <w:sz w:val="22"/>
@@ -2342,6 +2535,7 @@
         </w:rPr>
         <w:t>odrv0.axis</w:t>
       </w:r>
+      <w:proofErr w:type="gramStart"/>
       <w:r>
         <w:rPr>
           <w:rFonts w:asciiTheme="minorHAnsi" w:hAnsiTheme="minorHAnsi"/>
@@ -2356,7 +2550,16 @@
           <w:sz w:val="22"/>
           <w:szCs w:val="22"/>
         </w:rPr>
-        <w:t xml:space="preserve">.requested_state </w:t>
+        <w:t>.requested</w:t>
+      </w:r>
+      <w:proofErr w:type="gramEnd"/>
+      <w:r>
+        <w:rPr>
+          <w:rFonts w:asciiTheme="minorHAnsi" w:hAnsiTheme="minorHAnsi"/>
+          <w:sz w:val="22"/>
+          <w:szCs w:val="22"/>
+        </w:rPr>
+        <w:t xml:space="preserve">_state </w:t>
       </w:r>
       <w:r>
         <w:rPr>
@@ -2379,7 +2582,6 @@
     <w:p>
       <w:pPr>
         <w:pStyle w:val="HTMLPreformatted"/>
-        <w:ind w:left="360"/>
         <w:rPr>
           <w:rFonts w:asciiTheme="minorHAnsi" w:hAnsiTheme="minorHAnsi"/>
           <w:sz w:val="22"/>
@@ -2394,6 +2596,7 @@
         </w:rPr>
         <w:t>odrv0.axis</w:t>
       </w:r>
+      <w:proofErr w:type="gramStart"/>
       <w:r>
         <w:rPr>
           <w:rFonts w:asciiTheme="minorHAnsi" w:hAnsiTheme="minorHAnsi"/>
@@ -2408,7 +2611,16 @@
           <w:sz w:val="22"/>
           <w:szCs w:val="22"/>
         </w:rPr>
-        <w:t xml:space="preserve">.controller.input_vel </w:t>
+        <w:t>.controller</w:t>
+      </w:r>
+      <w:proofErr w:type="gramEnd"/>
+      <w:r>
+        <w:rPr>
+          <w:rFonts w:asciiTheme="minorHAnsi" w:hAnsiTheme="minorHAnsi"/>
+          <w:sz w:val="22"/>
+          <w:szCs w:val="22"/>
+        </w:rPr>
+        <w:t xml:space="preserve">.input_vel </w:t>
       </w:r>
       <w:r>
         <w:rPr>
@@ -2431,7 +2643,6 @@
     <w:p>
       <w:pPr>
         <w:pStyle w:val="HTMLPreformatted"/>
-        <w:ind w:left="360"/>
         <w:rPr>
           <w:rFonts w:asciiTheme="minorHAnsi" w:hAnsiTheme="minorHAnsi"/>
           <w:sz w:val="22"/>
@@ -3353,7 +3564,6 @@
   <w:style w:type="character" w:default="1" w:styleId="DefaultParagraphFont">
     <w:name w:val="Default Paragraph Font"/>
     <w:uiPriority w:val="1"/>
-    <w:semiHidden/>
     <w:unhideWhenUsed/>
   </w:style>
   <w:style w:type="table" w:default="1" w:styleId="TableNormal">

</xml_diff>